<commit_message>
Update laporan: lebih ringkas, tambah identitas mahasiswa, perbaiki jumlah data 60
</commit_message>
<xml_diff>
--- a/Laporan_Analisis_Decision_Tree.docx
+++ b/Laporan_Analisis_Decision_Tree.docx
@@ -2,6 +2,7 @@
 <file path=word/document.xml><?xml version="1.0" encoding="utf-8"?>
 <w:document xmlns:wpc="http://schemas.microsoft.com/office/word/2010/wordprocessingCanvas" xmlns:mo="http://schemas.microsoft.com/office/mac/office/2008/main" xmlns:mc="http://schemas.openxmlformats.org/markup-compatibility/2006" xmlns:mv="urn:schemas-microsoft-com:mac:vml" xmlns:o="urn:schemas-microsoft-com:office:office" xmlns:r="http://schemas.openxmlformats.org/officeDocument/2006/relationships" xmlns:m="http://schemas.openxmlformats.org/officeDocument/2006/math" xmlns:v="urn:schemas-microsoft-com:vml" xmlns:wp14="http://schemas.microsoft.com/office/word/2010/wordprocessingDrawing" xmlns:wp="http://schemas.openxmlformats.org/drawingml/2006/wordprocessingDrawing" xmlns:w10="urn:schemas-microsoft-com:office:word" xmlns:w="http://schemas.openxmlformats.org/wordprocessingml/2006/main" xmlns:w14="http://schemas.microsoft.com/office/word/2010/wordml" xmlns:wpg="http://schemas.microsoft.com/office/word/2010/wordprocessingGroup" xmlns:wpi="http://schemas.microsoft.com/office/word/2010/wordprocessingInk" xmlns:wne="http://schemas.microsoft.com/office/word/2006/wordml" xmlns:wps="http://schemas.microsoft.com/office/word/2010/wordprocessingShape" mc:Ignorable="w14 wp14">
   <w:body>
+    <w:p/>
     <w:p/>
     <w:p/>
     <w:p>
@@ -11,9 +12,9 @@
       <w:r>
         <w:rPr>
           <w:b/>
-          <w:sz w:val="36"/>
+          <w:sz w:val="32"/>
         </w:rPr>
-        <w:t>LAPORAN ANALISIS DATA PENJUALAN</w:t>
+        <w:t>LAPORAN ANALISIS DECISION TREE</w:t>
         <w:br/>
       </w:r>
     </w:p>
@@ -23,13 +24,12 @@
       </w:pPr>
       <w:r>
         <w:rPr>
-          <w:sz w:val="28"/>
+          <w:sz w:val="26"/>
         </w:rPr>
-        <w:t>Menggunakan Metode Decision Tree</w:t>
-        <w:br/>
-        <w:t>(RapidMiner AI Studio)</w:t>
+        <w:t>Analisis Data Penjualan Menggunakan RapidMiner AI Studio</w:t>
       </w:r>
     </w:p>
+    <w:p/>
     <w:p/>
     <w:p/>
     <w:p>
@@ -37,7 +37,23 @@
         <w:jc w:val="center"/>
       </w:pPr>
       <w:r>
-        <w:t>Disusun dengan bantuan analisis RapidMiner AI Studio versi 12.1.001</w:t>
+        <w:rPr>
+          <w:b/>
+        </w:rPr>
+        <w:t>Disusun oleh:</w:t>
+        <w:br/>
+      </w:r>
+    </w:p>
+    <w:p>
+      <w:pPr>
+        <w:jc w:val="center"/>
+      </w:pPr>
+      <w:r>
+        <w:t>Nama : MARCUS DEDY WAN SETIANTARA</w:t>
+        <w:br/>
+      </w:r>
+      <w:r>
+        <w:t>NIM  : 2520101006</w:t>
       </w:r>
     </w:p>
     <w:p>
@@ -50,56 +66,12 @@
         <w:pStyle w:val="Heading1"/>
       </w:pPr>
       <w:r>
-        <w:t>BAB 1: PENDAHULUAN</w:t>
-      </w:r>
-    </w:p>
-    <w:p>
-      <w:pPr>
-        <w:pStyle w:val="Heading2"/>
-      </w:pPr>
-      <w:r>
-        <w:t>1.1 Latar Belakang</w:t>
+        <w:t>1. Pendahuluan</w:t>
       </w:r>
     </w:p>
     <w:p>
       <w:r>
-        <w:t>Analisis data penjualan merupakan aspek penting dalam pengambilan keputusan bisnis. Dengan menggunakan teknik data mining, khususnya metode Decision Tree (pohon keputusan), kita dapat menemukan pola-pola tersembunyi dalam data penjualan yang dapat membantu perusahaan dalam memprediksi dan mengoptimalkan strategi penjualan.</w:t>
-      </w:r>
-    </w:p>
-    <w:p>
-      <w:pPr>
-        <w:pStyle w:val="Heading2"/>
-      </w:pPr>
-      <w:r>
-        <w:t>1.2 Tujuan Analisis</w:t>
-      </w:r>
-    </w:p>
-    <w:p>
-      <w:r>
-        <w:t>Tujuan dari analisis ini adalah untuk membangun model prediktif menggunakan algoritma Decision Tree yang dapat mengklasifikasikan pola penjualan (Gross Sales) berdasarkan atribut-atribut yang tersedia dalam dataset.</w:t>
-      </w:r>
-    </w:p>
-    <w:p>
-      <w:pPr>
-        <w:pStyle w:val="Heading2"/>
-      </w:pPr>
-      <w:r>
-        <w:t>1.3 Alat yang Digunakan</w:t>
-      </w:r>
-    </w:p>
-    <w:p>
-      <w:r>
-        <w:t>• RapidMiner AI Studio versi 12.1.001</w:t>
-      </w:r>
-    </w:p>
-    <w:p>
-      <w:r>
-        <w:t>• Algoritma: Parallel Decision Tree (Gain Ratio)</w:t>
-      </w:r>
-    </w:p>
-    <w:p>
-      <w:r>
-        <w:br w:type="page"/>
+        <w:t>Laporan ini menyajikan hasil analisis data penjualan menggunakan metode Decision Tree pada RapidMiner AI Studio versi 12.1.001. Tujuan analisis adalah membangun model klasifikasi yang dapat mengidentifikasi pola penjualan (Gross Sales) berdasarkan atribut-atribut prediktor.</w:t>
       </w:r>
     </w:p>
     <w:p>
@@ -107,1101 +79,12 @@
         <w:pStyle w:val="Heading1"/>
       </w:pPr>
       <w:r>
-        <w:t>BAB 2: DESKRIPSI DATA</w:t>
-      </w:r>
-    </w:p>
-    <w:p>
-      <w:pPr>
-        <w:pStyle w:val="Heading2"/>
-      </w:pPr>
-      <w:r>
-        <w:t>2.1 Sumber Data</w:t>
+        <w:t>2. Deskripsi Data</w:t>
       </w:r>
     </w:p>
     <w:p>
       <w:r>
-        <w:t>Dataset yang digunakan berasal dari file "Sales Data.xlsx" yang memiliki 62 baris data dan 6 kolom atribut.</w:t>
-      </w:r>
-    </w:p>
-    <w:p>
-      <w:pPr>
-        <w:pStyle w:val="Heading2"/>
-      </w:pPr>
-      <w:r>
-        <w:t>2.2 Atribut Data</w:t>
-      </w:r>
-    </w:p>
-    <w:p>
-      <w:r>
-        <w:t>Berikut adalah atribut-atribut yang terdapat dalam dataset:</w:t>
-      </w:r>
-    </w:p>
-    <w:tbl>
-      <w:tblPr>
-        <w:tblStyle w:val="TableGrid"/>
-        <w:tblW w:type="auto" w:w="0"/>
-        <w:tblLook w:firstColumn="1" w:firstRow="1" w:lastColumn="0" w:lastRow="0" w:noHBand="0" w:noVBand="1" w:val="04A0"/>
-      </w:tblPr>
-      <w:tblGrid>
-        <w:gridCol w:w="2160"/>
-        <w:gridCol w:w="2160"/>
-        <w:gridCol w:w="2160"/>
-        <w:gridCol w:w="2160"/>
-      </w:tblGrid>
-      <w:tr>
-        <w:tc>
-          <w:tcPr>
-            <w:tcW w:type="dxa" w:w="2160"/>
-          </w:tcPr>
-          <w:p>
-            <w:r>
-              <w:rPr>
-                <w:b/>
-              </w:rPr>
-              <w:t>No</w:t>
-            </w:r>
-          </w:p>
-        </w:tc>
-        <w:tc>
-          <w:tcPr>
-            <w:tcW w:type="dxa" w:w="2160"/>
-          </w:tcPr>
-          <w:p>
-            <w:r>
-              <w:rPr>
-                <w:b/>
-              </w:rPr>
-              <w:t>Nama Atribut</w:t>
-            </w:r>
-          </w:p>
-        </w:tc>
-        <w:tc>
-          <w:tcPr>
-            <w:tcW w:type="dxa" w:w="2160"/>
-          </w:tcPr>
-          <w:p>
-            <w:r>
-              <w:rPr>
-                <w:b/>
-              </w:rPr>
-              <w:t>Tipe Data</w:t>
-            </w:r>
-          </w:p>
-        </w:tc>
-        <w:tc>
-          <w:tcPr>
-            <w:tcW w:type="dxa" w:w="2160"/>
-          </w:tcPr>
-          <w:p>
-            <w:r>
-              <w:rPr>
-                <w:b/>
-              </w:rPr>
-              <w:t>Keterangan</w:t>
-            </w:r>
-          </w:p>
-        </w:tc>
-      </w:tr>
-      <w:tr>
-        <w:tc>
-          <w:tcPr>
-            <w:tcW w:type="dxa" w:w="2160"/>
-          </w:tcPr>
-          <w:p>
-            <w:r>
-              <w:t>1</w:t>
-            </w:r>
-          </w:p>
-        </w:tc>
-        <w:tc>
-          <w:tcPr>
-            <w:tcW w:type="dxa" w:w="2160"/>
-          </w:tcPr>
-          <w:p>
-            <w:r>
-              <w:t>Customer</w:t>
-            </w:r>
-          </w:p>
-        </w:tc>
-        <w:tc>
-          <w:tcPr>
-            <w:tcW w:type="dxa" w:w="2160"/>
-          </w:tcPr>
-          <w:p>
-            <w:r>
-              <w:t>Polynominal</w:t>
-            </w:r>
-          </w:p>
-        </w:tc>
-        <w:tc>
-          <w:tcPr>
-            <w:tcW w:type="dxa" w:w="2160"/>
-          </w:tcPr>
-          <w:p>
-            <w:r>
-              <w:t>Identitas pelanggan (1-62)</w:t>
-            </w:r>
-          </w:p>
-        </w:tc>
-      </w:tr>
-      <w:tr>
-        <w:tc>
-          <w:tcPr>
-            <w:tcW w:type="dxa" w:w="2160"/>
-          </w:tcPr>
-          <w:p>
-            <w:r>
-              <w:t>2</w:t>
-            </w:r>
-          </w:p>
-        </w:tc>
-        <w:tc>
-          <w:tcPr>
-            <w:tcW w:type="dxa" w:w="2160"/>
-          </w:tcPr>
-          <w:p>
-            <w:r>
-              <w:t>Percent Gross Profit</w:t>
-            </w:r>
-          </w:p>
-        </w:tc>
-        <w:tc>
-          <w:tcPr>
-            <w:tcW w:type="dxa" w:w="2160"/>
-          </w:tcPr>
-          <w:p>
-            <w:r>
-              <w:t>Real (Desimal)</w:t>
-            </w:r>
-          </w:p>
-        </w:tc>
-        <w:tc>
-          <w:tcPr>
-            <w:tcW w:type="dxa" w:w="2160"/>
-          </w:tcPr>
-          <w:p>
-            <w:r>
-              <w:t>Persentase laba kotor (0.03 - 0.60)</w:t>
-            </w:r>
-          </w:p>
-        </w:tc>
-      </w:tr>
-      <w:tr>
-        <w:tc>
-          <w:tcPr>
-            <w:tcW w:type="dxa" w:w="2160"/>
-          </w:tcPr>
-          <w:p>
-            <w:r>
-              <w:t>3</w:t>
-            </w:r>
-          </w:p>
-        </w:tc>
-        <w:tc>
-          <w:tcPr>
-            <w:tcW w:type="dxa" w:w="2160"/>
-          </w:tcPr>
-          <w:p>
-            <w:r>
-              <w:t>Gross Sales</w:t>
-            </w:r>
-          </w:p>
-        </w:tc>
-        <w:tc>
-          <w:tcPr>
-            <w:tcW w:type="dxa" w:w="2160"/>
-          </w:tcPr>
-          <w:p>
-            <w:r>
-              <w:t>Integer</w:t>
-            </w:r>
-          </w:p>
-        </w:tc>
-        <w:tc>
-          <w:tcPr>
-            <w:tcW w:type="dxa" w:w="2160"/>
-          </w:tcPr>
-          <w:p>
-            <w:r>
-              <w:t>Total penjualan kotor (170 - 179,101) - TARGET/LABEL</w:t>
-            </w:r>
-          </w:p>
-        </w:tc>
-      </w:tr>
-      <w:tr>
-        <w:tc>
-          <w:tcPr>
-            <w:tcW w:type="dxa" w:w="2160"/>
-          </w:tcPr>
-          <w:p>
-            <w:r>
-              <w:t>4</w:t>
-            </w:r>
-          </w:p>
-        </w:tc>
-        <w:tc>
-          <w:tcPr>
-            <w:tcW w:type="dxa" w:w="2160"/>
-          </w:tcPr>
-          <w:p>
-            <w:r>
-              <w:t>Gross Profit</w:t>
-            </w:r>
-          </w:p>
-        </w:tc>
-        <w:tc>
-          <w:tcPr>
-            <w:tcW w:type="dxa" w:w="2160"/>
-          </w:tcPr>
-          <w:p>
-            <w:r>
-              <w:t>Real (Desimal)</w:t>
-            </w:r>
-          </w:p>
-        </w:tc>
-        <w:tc>
-          <w:tcPr>
-            <w:tcW w:type="dxa" w:w="2160"/>
-          </w:tcPr>
-          <w:p>
-            <w:r>
-              <w:t>Laba kotor (40.6 - 25,379.34)</w:t>
-            </w:r>
-          </w:p>
-        </w:tc>
-      </w:tr>
-      <w:tr>
-        <w:tc>
-          <w:tcPr>
-            <w:tcW w:type="dxa" w:w="2160"/>
-          </w:tcPr>
-          <w:p>
-            <w:r>
-              <w:t>5</w:t>
-            </w:r>
-          </w:p>
-        </w:tc>
-        <w:tc>
-          <w:tcPr>
-            <w:tcW w:type="dxa" w:w="2160"/>
-          </w:tcPr>
-          <w:p>
-            <w:r>
-              <w:t>Industry Code</w:t>
-            </w:r>
-          </w:p>
-        </w:tc>
-        <w:tc>
-          <w:tcPr>
-            <w:tcW w:type="dxa" w:w="2160"/>
-          </w:tcPr>
-          <w:p>
-            <w:r>
-              <w:t>Integer</w:t>
-            </w:r>
-          </w:p>
-        </w:tc>
-        <w:tc>
-          <w:tcPr>
-            <w:tcW w:type="dxa" w:w="2160"/>
-          </w:tcPr>
-          <w:p>
-            <w:r>
-              <w:t>Kode industri (1-7)</w:t>
-            </w:r>
-          </w:p>
-        </w:tc>
-      </w:tr>
-      <w:tr>
-        <w:tc>
-          <w:tcPr>
-            <w:tcW w:type="dxa" w:w="2160"/>
-          </w:tcPr>
-          <w:p>
-            <w:r>
-              <w:t>6</w:t>
-            </w:r>
-          </w:p>
-        </w:tc>
-        <w:tc>
-          <w:tcPr>
-            <w:tcW w:type="dxa" w:w="2160"/>
-          </w:tcPr>
-          <w:p>
-            <w:r>
-              <w:t>Competitive Rating*</w:t>
-            </w:r>
-          </w:p>
-        </w:tc>
-        <w:tc>
-          <w:tcPr>
-            <w:tcW w:type="dxa" w:w="2160"/>
-          </w:tcPr>
-          <w:p>
-            <w:r>
-              <w:t>Integer</w:t>
-            </w:r>
-          </w:p>
-        </w:tc>
-        <w:tc>
-          <w:tcPr>
-            <w:tcW w:type="dxa" w:w="2160"/>
-          </w:tcPr>
-          <w:p>
-            <w:r>
-              <w:t>Rating kompetisi (1-5)</w:t>
-            </w:r>
-          </w:p>
-        </w:tc>
-      </w:tr>
-    </w:tbl>
-    <w:p/>
-    <w:p>
-      <w:pPr>
-        <w:pStyle w:val="Heading2"/>
-      </w:pPr>
-      <w:r>
-        <w:t>2.3 Statistik Deskriptif</w:t>
-      </w:r>
-    </w:p>
-    <w:p>
-      <w:r>
-        <w:t>Berikut adalah ringkasan statistik dari data numerik:</w:t>
-      </w:r>
-    </w:p>
-    <w:tbl>
-      <w:tblPr>
-        <w:tblStyle w:val="TableGrid"/>
-        <w:tblW w:type="auto" w:w="0"/>
-        <w:tblLook w:firstColumn="1" w:firstRow="1" w:lastColumn="0" w:lastRow="0" w:noHBand="0" w:noVBand="1" w:val="04A0"/>
-      </w:tblPr>
-      <w:tblGrid>
-        <w:gridCol w:w="1440"/>
-        <w:gridCol w:w="1440"/>
-        <w:gridCol w:w="1440"/>
-        <w:gridCol w:w="1440"/>
-        <w:gridCol w:w="1440"/>
-        <w:gridCol w:w="1440"/>
-      </w:tblGrid>
-      <w:tr>
-        <w:tc>
-          <w:tcPr>
-            <w:tcW w:type="dxa" w:w="1440"/>
-          </w:tcPr>
-          <w:p>
-            <w:r>
-              <w:rPr>
-                <w:b/>
-              </w:rPr>
-              <w:t>Statistik</w:t>
-            </w:r>
-          </w:p>
-        </w:tc>
-        <w:tc>
-          <w:tcPr>
-            <w:tcW w:type="dxa" w:w="1440"/>
-          </w:tcPr>
-          <w:p>
-            <w:r>
-              <w:rPr>
-                <w:b/>
-              </w:rPr>
-              <w:t>Percent Gross Profit</w:t>
-            </w:r>
-          </w:p>
-        </w:tc>
-        <w:tc>
-          <w:tcPr>
-            <w:tcW w:type="dxa" w:w="1440"/>
-          </w:tcPr>
-          <w:p>
-            <w:r>
-              <w:rPr>
-                <w:b/>
-              </w:rPr>
-              <w:t>Gross Sales</w:t>
-            </w:r>
-          </w:p>
-        </w:tc>
-        <w:tc>
-          <w:tcPr>
-            <w:tcW w:type="dxa" w:w="1440"/>
-          </w:tcPr>
-          <w:p>
-            <w:r>
-              <w:rPr>
-                <w:b/>
-              </w:rPr>
-              <w:t>Gross Profit</w:t>
-            </w:r>
-          </w:p>
-        </w:tc>
-        <w:tc>
-          <w:tcPr>
-            <w:tcW w:type="dxa" w:w="1440"/>
-          </w:tcPr>
-          <w:p>
-            <w:r>
-              <w:rPr>
-                <w:b/>
-              </w:rPr>
-              <w:t>Industry Code</w:t>
-            </w:r>
-          </w:p>
-        </w:tc>
-        <w:tc>
-          <w:tcPr>
-            <w:tcW w:type="dxa" w:w="1440"/>
-          </w:tcPr>
-          <w:p>
-            <w:r>
-              <w:rPr>
-                <w:b/>
-              </w:rPr>
-              <w:t>Competitive Rating*</w:t>
-            </w:r>
-          </w:p>
-        </w:tc>
-      </w:tr>
-      <w:tr>
-        <w:tc>
-          <w:tcPr>
-            <w:tcW w:type="dxa" w:w="1440"/>
-          </w:tcPr>
-          <w:p>
-            <w:r>
-              <w:t>Jumlah Data</w:t>
-            </w:r>
-          </w:p>
-        </w:tc>
-        <w:tc>
-          <w:tcPr>
-            <w:tcW w:type="dxa" w:w="1440"/>
-          </w:tcPr>
-          <w:p>
-            <w:r>
-              <w:t>60.00</w:t>
-            </w:r>
-          </w:p>
-        </w:tc>
-        <w:tc>
-          <w:tcPr>
-            <w:tcW w:type="dxa" w:w="1440"/>
-          </w:tcPr>
-          <w:p>
-            <w:r>
-              <w:t>60.00</w:t>
-            </w:r>
-          </w:p>
-        </w:tc>
-        <w:tc>
-          <w:tcPr>
-            <w:tcW w:type="dxa" w:w="1440"/>
-          </w:tcPr>
-          <w:p>
-            <w:r>
-              <w:t>60.00</w:t>
-            </w:r>
-          </w:p>
-        </w:tc>
-        <w:tc>
-          <w:tcPr>
-            <w:tcW w:type="dxa" w:w="1440"/>
-          </w:tcPr>
-          <w:p>
-            <w:r>
-              <w:t>60.00</w:t>
-            </w:r>
-          </w:p>
-        </w:tc>
-        <w:tc>
-          <w:tcPr>
-            <w:tcW w:type="dxa" w:w="1440"/>
-          </w:tcPr>
-          <w:p>
-            <w:r>
-              <w:t>60.00</w:t>
-            </w:r>
-          </w:p>
-        </w:tc>
-      </w:tr>
-      <w:tr>
-        <w:tc>
-          <w:tcPr>
-            <w:tcW w:type="dxa" w:w="1440"/>
-          </w:tcPr>
-          <w:p>
-            <w:r>
-              <w:t>Rata-rata</w:t>
-            </w:r>
-          </w:p>
-        </w:tc>
-        <w:tc>
-          <w:tcPr>
-            <w:tcW w:type="dxa" w:w="1440"/>
-          </w:tcPr>
-          <w:p>
-            <w:r>
-              <w:t>0.21</w:t>
-            </w:r>
-          </w:p>
-        </w:tc>
-        <w:tc>
-          <w:tcPr>
-            <w:tcW w:type="dxa" w:w="1440"/>
-          </w:tcPr>
-          <w:p>
-            <w:r>
-              <w:t>25016.50</w:t>
-            </w:r>
-          </w:p>
-        </w:tc>
-        <w:tc>
-          <w:tcPr>
-            <w:tcW w:type="dxa" w:w="1440"/>
-          </w:tcPr>
-          <w:p>
-            <w:r>
-              <w:t>4239.16</w:t>
-            </w:r>
-          </w:p>
-        </w:tc>
-        <w:tc>
-          <w:tcPr>
-            <w:tcW w:type="dxa" w:w="1440"/>
-          </w:tcPr>
-          <w:p>
-            <w:r>
-              <w:t>4.48</w:t>
-            </w:r>
-          </w:p>
-        </w:tc>
-        <w:tc>
-          <w:tcPr>
-            <w:tcW w:type="dxa" w:w="1440"/>
-          </w:tcPr>
-          <w:p>
-            <w:r>
-              <w:t>3.00</w:t>
-            </w:r>
-          </w:p>
-        </w:tc>
-      </w:tr>
-      <w:tr>
-        <w:tc>
-          <w:tcPr>
-            <w:tcW w:type="dxa" w:w="1440"/>
-          </w:tcPr>
-          <w:p>
-            <w:r>
-              <w:t>Std. Deviasi</w:t>
-            </w:r>
-          </w:p>
-        </w:tc>
-        <w:tc>
-          <w:tcPr>
-            <w:tcW w:type="dxa" w:w="1440"/>
-          </w:tcPr>
-          <w:p>
-            <w:r>
-              <w:t>0.11</w:t>
-            </w:r>
-          </w:p>
-        </w:tc>
-        <w:tc>
-          <w:tcPr>
-            <w:tcW w:type="dxa" w:w="1440"/>
-          </w:tcPr>
-          <w:p>
-            <w:r>
-              <w:t>36344.57</w:t>
-            </w:r>
-          </w:p>
-        </w:tc>
-        <w:tc>
-          <w:tcPr>
-            <w:tcW w:type="dxa" w:w="1440"/>
-          </w:tcPr>
-          <w:p>
-            <w:r>
-              <w:t>5811.73</w:t>
-            </w:r>
-          </w:p>
-        </w:tc>
-        <w:tc>
-          <w:tcPr>
-            <w:tcW w:type="dxa" w:w="1440"/>
-          </w:tcPr>
-          <w:p>
-            <w:r>
-              <w:t>1.90</w:t>
-            </w:r>
-          </w:p>
-        </w:tc>
-        <w:tc>
-          <w:tcPr>
-            <w:tcW w:type="dxa" w:w="1440"/>
-          </w:tcPr>
-          <w:p>
-            <w:r>
-              <w:t>1.09</w:t>
-            </w:r>
-          </w:p>
-        </w:tc>
-      </w:tr>
-      <w:tr>
-        <w:tc>
-          <w:tcPr>
-            <w:tcW w:type="dxa" w:w="1440"/>
-          </w:tcPr>
-          <w:p>
-            <w:r>
-              <w:t>Minimum</w:t>
-            </w:r>
-          </w:p>
-        </w:tc>
-        <w:tc>
-          <w:tcPr>
-            <w:tcW w:type="dxa" w:w="1440"/>
-          </w:tcPr>
-          <w:p>
-            <w:r>
-              <w:t>0.03</w:t>
-            </w:r>
-          </w:p>
-        </w:tc>
-        <w:tc>
-          <w:tcPr>
-            <w:tcW w:type="dxa" w:w="1440"/>
-          </w:tcPr>
-          <w:p>
-            <w:r>
-              <w:t>170.00</w:t>
-            </w:r>
-          </w:p>
-        </w:tc>
-        <w:tc>
-          <w:tcPr>
-            <w:tcW w:type="dxa" w:w="1440"/>
-          </w:tcPr>
-          <w:p>
-            <w:r>
-              <w:t>40.60</w:t>
-            </w:r>
-          </w:p>
-        </w:tc>
-        <w:tc>
-          <w:tcPr>
-            <w:tcW w:type="dxa" w:w="1440"/>
-          </w:tcPr>
-          <w:p>
-            <w:r>
-              <w:t>1.00</w:t>
-            </w:r>
-          </w:p>
-        </w:tc>
-        <w:tc>
-          <w:tcPr>
-            <w:tcW w:type="dxa" w:w="1440"/>
-          </w:tcPr>
-          <w:p>
-            <w:r>
-              <w:t>1.00</w:t>
-            </w:r>
-          </w:p>
-        </w:tc>
-      </w:tr>
-      <w:tr>
-        <w:tc>
-          <w:tcPr>
-            <w:tcW w:type="dxa" w:w="1440"/>
-          </w:tcPr>
-          <w:p>
-            <w:r>
-              <w:t>Kuartil 1 (25%)</w:t>
-            </w:r>
-          </w:p>
-        </w:tc>
-        <w:tc>
-          <w:tcPr>
-            <w:tcW w:type="dxa" w:w="1440"/>
-          </w:tcPr>
-          <w:p>
-            <w:r>
-              <w:t>0.14</w:t>
-            </w:r>
-          </w:p>
-        </w:tc>
-        <w:tc>
-          <w:tcPr>
-            <w:tcW w:type="dxa" w:w="1440"/>
-          </w:tcPr>
-          <w:p>
-            <w:r>
-              <w:t>2645.75</w:t>
-            </w:r>
-          </w:p>
-        </w:tc>
-        <w:tc>
-          <w:tcPr>
-            <w:tcW w:type="dxa" w:w="1440"/>
-          </w:tcPr>
-          <w:p>
-            <w:r>
-              <w:t>435.06</w:t>
-            </w:r>
-          </w:p>
-        </w:tc>
-        <w:tc>
-          <w:tcPr>
-            <w:tcW w:type="dxa" w:w="1440"/>
-          </w:tcPr>
-          <w:p>
-            <w:r>
-              <w:t>3.00</w:t>
-            </w:r>
-          </w:p>
-        </w:tc>
-        <w:tc>
-          <w:tcPr>
-            <w:tcW w:type="dxa" w:w="1440"/>
-          </w:tcPr>
-          <w:p>
-            <w:r>
-              <w:t>2.00</w:t>
-            </w:r>
-          </w:p>
-        </w:tc>
-      </w:tr>
-      <w:tr>
-        <w:tc>
-          <w:tcPr>
-            <w:tcW w:type="dxa" w:w="1440"/>
-          </w:tcPr>
-          <w:p>
-            <w:r>
-              <w:t>Median (50%)</w:t>
-            </w:r>
-          </w:p>
-        </w:tc>
-        <w:tc>
-          <w:tcPr>
-            <w:tcW w:type="dxa" w:w="1440"/>
-          </w:tcPr>
-          <w:p>
-            <w:r>
-              <w:t>0.20</w:t>
-            </w:r>
-          </w:p>
-        </w:tc>
-        <w:tc>
-          <w:tcPr>
-            <w:tcW w:type="dxa" w:w="1440"/>
-          </w:tcPr>
-          <w:p>
-            <w:r>
-              <w:t>6760.00</w:t>
-            </w:r>
-          </w:p>
-        </w:tc>
-        <w:tc>
-          <w:tcPr>
-            <w:tcW w:type="dxa" w:w="1440"/>
-          </w:tcPr>
-          <w:p>
-            <w:r>
-              <w:t>1662.43</w:t>
-            </w:r>
-          </w:p>
-        </w:tc>
-        <w:tc>
-          <w:tcPr>
-            <w:tcW w:type="dxa" w:w="1440"/>
-          </w:tcPr>
-          <w:p>
-            <w:r>
-              <w:t>5.00</w:t>
-            </w:r>
-          </w:p>
-        </w:tc>
-        <w:tc>
-          <w:tcPr>
-            <w:tcW w:type="dxa" w:w="1440"/>
-          </w:tcPr>
-          <w:p>
-            <w:r>
-              <w:t>3.00</w:t>
-            </w:r>
-          </w:p>
-        </w:tc>
-      </w:tr>
-      <w:tr>
-        <w:tc>
-          <w:tcPr>
-            <w:tcW w:type="dxa" w:w="1440"/>
-          </w:tcPr>
-          <w:p>
-            <w:r>
-              <w:t>Kuartil 3 (75%)</w:t>
-            </w:r>
-          </w:p>
-        </w:tc>
-        <w:tc>
-          <w:tcPr>
-            <w:tcW w:type="dxa" w:w="1440"/>
-          </w:tcPr>
-          <w:p>
-            <w:r>
-              <w:t>0.24</w:t>
-            </w:r>
-          </w:p>
-        </w:tc>
-        <w:tc>
-          <w:tcPr>
-            <w:tcW w:type="dxa" w:w="1440"/>
-          </w:tcPr>
-          <w:p>
-            <w:r>
-              <w:t>32171.00</w:t>
-            </w:r>
-          </w:p>
-        </w:tc>
-        <w:tc>
-          <w:tcPr>
-            <w:tcW w:type="dxa" w:w="1440"/>
-          </w:tcPr>
-          <w:p>
-            <w:r>
-              <w:t>5690.39</w:t>
-            </w:r>
-          </w:p>
-        </w:tc>
-        <w:tc>
-          <w:tcPr>
-            <w:tcW w:type="dxa" w:w="1440"/>
-          </w:tcPr>
-          <w:p>
-            <w:r>
-              <w:t>6.00</w:t>
-            </w:r>
-          </w:p>
-        </w:tc>
-        <w:tc>
-          <w:tcPr>
-            <w:tcW w:type="dxa" w:w="1440"/>
-          </w:tcPr>
-          <w:p>
-            <w:r>
-              <w:t>4.00</w:t>
-            </w:r>
-          </w:p>
-        </w:tc>
-      </w:tr>
-      <w:tr>
-        <w:tc>
-          <w:tcPr>
-            <w:tcW w:type="dxa" w:w="1440"/>
-          </w:tcPr>
-          <w:p>
-            <w:r>
-              <w:t>Maksimum</w:t>
-            </w:r>
-          </w:p>
-        </w:tc>
-        <w:tc>
-          <w:tcPr>
-            <w:tcW w:type="dxa" w:w="1440"/>
-          </w:tcPr>
-          <w:p>
-            <w:r>
-              <w:t>0.60</w:t>
-            </w:r>
-          </w:p>
-        </w:tc>
-        <w:tc>
-          <w:tcPr>
-            <w:tcW w:type="dxa" w:w="1440"/>
-          </w:tcPr>
-          <w:p>
-            <w:r>
-              <w:t>179101.00</w:t>
-            </w:r>
-          </w:p>
-        </w:tc>
-        <w:tc>
-          <w:tcPr>
-            <w:tcW w:type="dxa" w:w="1440"/>
-          </w:tcPr>
-          <w:p>
-            <w:r>
-              <w:t>25379.34</w:t>
-            </w:r>
-          </w:p>
-        </w:tc>
-        <w:tc>
-          <w:tcPr>
-            <w:tcW w:type="dxa" w:w="1440"/>
-          </w:tcPr>
-          <w:p>
-            <w:r>
-              <w:t>7.00</w:t>
-            </w:r>
-          </w:p>
-        </w:tc>
-        <w:tc>
-          <w:tcPr>
-            <w:tcW w:type="dxa" w:w="1440"/>
-          </w:tcPr>
-          <w:p>
-            <w:r>
-              <w:t>5.00</w:t>
-            </w:r>
-          </w:p>
-        </w:tc>
-      </w:tr>
-    </w:tbl>
-    <w:p/>
-    <w:p>
-      <w:pPr>
-        <w:pStyle w:val="Heading2"/>
-      </w:pPr>
-      <w:r>
-        <w:t>2.4 Missing Values</w:t>
-      </w:r>
-    </w:p>
-    <w:p>
-      <w:r>
-        <w:t>Dataset ini memiliki beberapa missing values (data kosong) yang perlu ditangani sebelum proses pemodelan:</w:t>
-      </w:r>
-    </w:p>
-    <w:p>
-      <w:r>
-        <w:t>• Customer: 1 missing values</w:t>
-      </w:r>
-    </w:p>
-    <w:p>
-      <w:r>
-        <w:t>•  Percent Gross Profit: 2 missing values</w:t>
-      </w:r>
-    </w:p>
-    <w:p>
-      <w:r>
-        <w:t>• Gross Sales: 2 missing values</w:t>
-      </w:r>
-    </w:p>
-    <w:p>
-      <w:r>
-        <w:t>• Gross Profit: 2 missing values</w:t>
-      </w:r>
-    </w:p>
-    <w:p>
-      <w:r>
-        <w:t>• Industry Code: 2 missing values</w:t>
-      </w:r>
-    </w:p>
-    <w:p>
-      <w:r>
-        <w:t>• Competitive Rating*: 2 missing values</w:t>
-      </w:r>
-    </w:p>
-    <w:p>
-      <w:r>
-        <w:br/>
-        <w:t>Penanganan missing values dilakukan menggunakan metode rata-rata (average) melalui operator Replace Missing Values di RapidMiner.</w:t>
-      </w:r>
-    </w:p>
-    <w:p>
-      <w:r>
-        <w:br w:type="page"/>
-      </w:r>
-    </w:p>
-    <w:p>
-      <w:pPr>
-        <w:pStyle w:val="Heading1"/>
-      </w:pPr>
-      <w:r>
-        <w:t>BAB 3: METODOLOGI</w:t>
-      </w:r>
-    </w:p>
-    <w:p>
-      <w:pPr>
-        <w:pStyle w:val="Heading2"/>
-      </w:pPr>
-      <w:r>
-        <w:t>3.1 Alur Proses (Workflow)</w:t>
-      </w:r>
-    </w:p>
-    <w:p>
-      <w:r>
-        <w:t>Proses analisis data dilakukan menggunakan RapidMiner AI Studio dengan alur sebagai berikut:</w:t>
-      </w:r>
-    </w:p>
-    <w:p>
-      <w:r>
-        <w:t>1. Read Excel — Membaca data dari file "Sales Data.xlsx"</w:t>
-      </w:r>
-    </w:p>
-    <w:p>
-      <w:r>
-        <w:t>2. Replace Missing Values — Mengisi data kosong dengan nilai rata-rata (average)</w:t>
-      </w:r>
-    </w:p>
-    <w:p>
-      <w:r>
-        <w:t xml:space="preserve">   • Parameter: attribute_filter_type = all</w:t>
-      </w:r>
-    </w:p>
-    <w:p>
-      <w:r>
-        <w:t xml:space="preserve">   • Parameter: include_special_attributes = true</w:t>
-      </w:r>
-    </w:p>
-    <w:p>
-      <w:r>
-        <w:t xml:space="preserve">   • Parameter: default = average</w:t>
-      </w:r>
-    </w:p>
-    <w:p>
-      <w:r>
-        <w:t>3. Set Role — Menentukan kolom "Gross Sales" sebagai label (target prediksi)</w:t>
-      </w:r>
-    </w:p>
-    <w:p>
-      <w:r>
-        <w:t>4. Numerical to Polynominal — Mengubah tipe kolom "Gross Sales" dari numeric ke nominal</w:t>
-      </w:r>
-    </w:p>
-    <w:p>
-      <w:r>
-        <w:t xml:space="preserve">   • Parameter: attribute_filter_type = single</w:t>
-      </w:r>
-    </w:p>
-    <w:p>
-      <w:r>
-        <w:t xml:space="preserve">   • Parameter: attribute = Gross Sales</w:t>
-      </w:r>
-    </w:p>
-    <w:p>
-      <w:r>
-        <w:t xml:space="preserve">   • Parameter: include_special_attributes = true</w:t>
-      </w:r>
-    </w:p>
-    <w:p>
-      <w:r>
-        <w:t>5. Decision Tree — Membangun model pohon keputusan</w:t>
-      </w:r>
-    </w:p>
-    <w:p>
-      <w:pPr>
-        <w:pStyle w:val="Heading2"/>
-      </w:pPr>
-      <w:r>
-        <w:t>3.2 Parameter Decision Tree</w:t>
-      </w:r>
-    </w:p>
-    <w:p>
-      <w:r>
-        <w:t>Berikut adalah parameter yang digunakan pada algoritma Decision Tree:</w:t>
+        <w:t>Dataset berasal dari file "Sales Data.xlsx" dengan 60 baris data dan 6 kolom.</w:t>
       </w:r>
     </w:p>
     <w:tbl>
@@ -1238,7 +121,7 @@
               <w:rPr>
                 <w:b/>
               </w:rPr>
-              <w:t>Parameter</w:t>
+              <w:t>Atribut</w:t>
             </w:r>
           </w:p>
         </w:tc>
@@ -1251,7 +134,7 @@
               <w:rPr>
                 <w:b/>
               </w:rPr>
-              <w:t>Nilai</w:t>
+              <w:t>Keterangan</w:t>
             </w:r>
           </w:p>
         </w:tc>
@@ -1273,7 +156,7 @@
           </w:tcPr>
           <w:p>
             <w:r>
-              <w:t>Criterion</w:t>
+              <w:t>Customer</w:t>
             </w:r>
           </w:p>
         </w:tc>
@@ -1283,7 +166,7 @@
           </w:tcPr>
           <w:p>
             <w:r>
-              <w:t>Gain Ratio</w:t>
+              <w:t>Identitas pelanggan (1-60)</w:t>
             </w:r>
           </w:p>
         </w:tc>
@@ -1305,7 +188,7 @@
           </w:tcPr>
           <w:p>
             <w:r>
-              <w:t>Maximal Depth</w:t>
+              <w:t>Percent Gross Profit</w:t>
             </w:r>
           </w:p>
         </w:tc>
@@ -1315,7 +198,7 @@
           </w:tcPr>
           <w:p>
             <w:r>
-              <w:t>10</w:t>
+              <w:t>Persentase laba kotor (0.03 - 0.60)</w:t>
             </w:r>
           </w:p>
         </w:tc>
@@ -1337,7 +220,7 @@
           </w:tcPr>
           <w:p>
             <w:r>
-              <w:t>Apply Pruning</w:t>
+              <w:t>Gross Sales (Label)</w:t>
             </w:r>
           </w:p>
         </w:tc>
@@ -1347,7 +230,7 @@
           </w:tcPr>
           <w:p>
             <w:r>
-              <w:t>True</w:t>
+              <w:t>Total penjualan kotor - TARGET</w:t>
             </w:r>
           </w:p>
         </w:tc>
@@ -1369,7 +252,7 @@
           </w:tcPr>
           <w:p>
             <w:r>
-              <w:t>Confidence</w:t>
+              <w:t>Gross Profit</w:t>
             </w:r>
           </w:p>
         </w:tc>
@@ -1379,7 +262,7 @@
           </w:tcPr>
           <w:p>
             <w:r>
-              <w:t>0.1</w:t>
+              <w:t>Laba kotor (40.6 - 25,379.34)</w:t>
             </w:r>
           </w:p>
         </w:tc>
@@ -1401,7 +284,7 @@
           </w:tcPr>
           <w:p>
             <w:r>
-              <w:t>Apply Pre-pruning</w:t>
+              <w:t>Industry Code</w:t>
             </w:r>
           </w:p>
         </w:tc>
@@ -1411,7 +294,7 @@
           </w:tcPr>
           <w:p>
             <w:r>
-              <w:t>True</w:t>
+              <w:t>Kode industri (1-7)</w:t>
             </w:r>
           </w:p>
         </w:tc>
@@ -1433,7 +316,7 @@
           </w:tcPr>
           <w:p>
             <w:r>
-              <w:t>Minimal Gain</w:t>
+              <w:t>Competitive Rating*</w:t>
             </w:r>
           </w:p>
         </w:tc>
@@ -1443,71 +326,7 @@
           </w:tcPr>
           <w:p>
             <w:r>
-              <w:t>0.01</w:t>
-            </w:r>
-          </w:p>
-        </w:tc>
-      </w:tr>
-      <w:tr>
-        <w:tc>
-          <w:tcPr>
-            <w:tcW w:type="dxa" w:w="2880"/>
-          </w:tcPr>
-          <w:p>
-            <w:r>
-              <w:t>7</w:t>
-            </w:r>
-          </w:p>
-        </w:tc>
-        <w:tc>
-          <w:tcPr>
-            <w:tcW w:type="dxa" w:w="2880"/>
-          </w:tcPr>
-          <w:p>
-            <w:r>
-              <w:t>Minimal Leaf Size</w:t>
-            </w:r>
-          </w:p>
-        </w:tc>
-        <w:tc>
-          <w:tcPr>
-            <w:tcW w:type="dxa" w:w="2880"/>
-          </w:tcPr>
-          <w:p>
-            <w:r>
-              <w:t>2</w:t>
-            </w:r>
-          </w:p>
-        </w:tc>
-      </w:tr>
-      <w:tr>
-        <w:tc>
-          <w:tcPr>
-            <w:tcW w:type="dxa" w:w="2880"/>
-          </w:tcPr>
-          <w:p>
-            <w:r>
-              <w:t>8</w:t>
-            </w:r>
-          </w:p>
-        </w:tc>
-        <w:tc>
-          <w:tcPr>
-            <w:tcW w:type="dxa" w:w="2880"/>
-          </w:tcPr>
-          <w:p>
-            <w:r>
-              <w:t>Minimal Size for Split</w:t>
-            </w:r>
-          </w:p>
-        </w:tc>
-        <w:tc>
-          <w:tcPr>
-            <w:tcW w:type="dxa" w:w="2880"/>
-          </w:tcPr>
-          <w:p>
-            <w:r>
-              <w:t>4</w:t>
+              <w:t>Rating kompetisi (1-5)</w:t>
             </w:r>
           </w:p>
         </w:tc>
@@ -1515,26 +334,8 @@
     </w:tbl>
     <w:p/>
     <w:p>
-      <w:pPr>
-        <w:pStyle w:val="Heading2"/>
-      </w:pPr>
       <w:r>
-        <w:t>3.3 Penjelasan Metode</w:t>
-      </w:r>
-    </w:p>
-    <w:p>
-      <w:r>
-        <w:t>Decision Tree (Pohon Keputusan) adalah salah satu algoritma klasifikasi yang paling populer dalam data mining. Algoritma ini bekerja dengan cara membangun struktur pohon dimana setiap node internal merepresentasikan pengujian terhadap suatu atribut, setiap cabang merepresentasikan hasil pengujian, dan setiap daun (leaf) merepresentasikan kelas/label.</w:t>
-      </w:r>
-    </w:p>
-    <w:p>
-      <w:r>
-        <w:t>Criterion Gain Ratio dipilih karena merupakan penyempurnaan dari Information Gain yang mengurangi bias terhadap atribut dengan banyak nilai. Gain Ratio menormalisasi Information Gain dengan membagi Split Information, sehingga menghasilkan pembagian yang lebih seimbang.</w:t>
-      </w:r>
-    </w:p>
-    <w:p>
-      <w:r>
-        <w:br w:type="page"/>
+        <w:t>Catatan: Competitive Rating menunjukkan tingkat persaingan penjualan produk (1 = sangat sedikit kompetisi, 5 = sangat kompetitif).</w:t>
       </w:r>
     </w:p>
     <w:p>
@@ -1542,20 +343,56 @@
         <w:pStyle w:val="Heading1"/>
       </w:pPr>
       <w:r>
-        <w:t>BAB 4: HASIL ANALISIS</w:t>
+        <w:t>3. Metodologi</w:t>
+      </w:r>
+    </w:p>
+    <w:p>
+      <w:r>
+        <w:t>Alur proses di RapidMiner:</w:t>
+      </w:r>
+    </w:p>
+    <w:p>
+      <w:r>
+        <w:t>1. Read Excel → Membaca data Sales Data.xlsx</w:t>
+      </w:r>
+    </w:p>
+    <w:p>
+      <w:r>
+        <w:t>2. Replace Missing Values → Mengisi data kosong dengan rata-rata</w:t>
+      </w:r>
+    </w:p>
+    <w:p>
+      <w:r>
+        <w:t>3. Set Role → Menentukan "Gross Sales" sebagai label</w:t>
+      </w:r>
+    </w:p>
+    <w:p>
+      <w:r>
+        <w:t>4. Numerical to Polynominal → Mengubah Gross Sales ke tipe nominal</w:t>
+      </w:r>
+    </w:p>
+    <w:p>
+      <w:r>
+        <w:t>5. Decision Tree → Membangun model (criterion: Gain Ratio, max depth: 10)</w:t>
+      </w:r>
+    </w:p>
+    <w:p/>
+    <w:p>
+      <w:r>
+        <w:t>Decision Tree dengan Gain Ratio dipilih karena mampu mengatasi bias terhadap atribut dengan banyak nilai, sehingga menghasilkan pembagian pohon yang lebih seimbang.</w:t>
       </w:r>
     </w:p>
     <w:p>
       <w:pPr>
-        <w:pStyle w:val="Heading2"/>
+        <w:pStyle w:val="Heading1"/>
       </w:pPr>
       <w:r>
-        <w:t>4.1 Visualisasi Decision Tree</w:t>
+        <w:t>4. Hasil Analisis</w:t>
       </w:r>
     </w:p>
     <w:p>
       <w:r>
-        <w:t>Berikut adalah hasil visualisasi pohon keputusan yang dihasilkan oleh RapidMiner:</w:t>
+        <w:t>Berikut hasil visualisasi pohon keputusan:</w:t>
       </w:r>
     </w:p>
     <w:p>
@@ -1602,44 +439,13 @@
         <w:jc w:val="center"/>
       </w:pPr>
       <w:r>
-        <w:t>Gambar 4.1: Hasil Decision Tree dari RapidMiner AI Studio</w:t>
+        <w:t>Gambar 1: Hasil Decision Tree</w:t>
       </w:r>
     </w:p>
     <w:p/>
     <w:p>
-      <w:pPr>
-        <w:pStyle w:val="Heading2"/>
-      </w:pPr>
       <w:r>
-        <w:t>4.2 Interpretasi Hasil</w:t>
-      </w:r>
-    </w:p>
-    <w:p>
-      <w:r>
-        <w:t>Dari hasil Decision Tree yang dihasilkan, dapat diinterpretasikan bahwa model telah berhasil membangun aturan klasifikasi berdasarkan atribut-atribut yang tersedia. Model ini menggunakan atribut Percent Gross Profit, Gross Profit, Industry Code, dan Competitive Rating sebagai variabel prediktor untuk mengklasifikasikan Gross Sales.</w:t>
-      </w:r>
-    </w:p>
-    <w:p>
-      <w:pPr>
-        <w:pStyle w:val="Heading2"/>
-      </w:pPr>
-      <w:r>
-        <w:t>4.3 Catatan Penting</w:t>
-      </w:r>
-    </w:p>
-    <w:p>
-      <w:r>
-        <w:t>Perlu diperhatikan bahwa dalam analisis ini, kolom Gross Sales yang bersifat numerik (kontinu) telah dikonversi menjadi tipe nominal (kategorikal) menggunakan operator Numerical to Polynominal. Hal ini berarti setiap nilai unik Gross Sales diperlakukan sebagai kategori tersendiri.</w:t>
-      </w:r>
-    </w:p>
-    <w:p>
-      <w:r>
-        <w:t>Untuk hasil yang lebih bermakna, disarankan menggunakan operator Discretize by Binning yang akan membagi Gross Sales menjadi beberapa kategori (misalnya: Rendah, Sedang, Tinggi) sehingga interpretasi hasil lebih mudah dipahami.</w:t>
-      </w:r>
-    </w:p>
-    <w:p>
-      <w:r>
-        <w:br w:type="page"/>
+        <w:t>Model Decision Tree berhasil dibangun dan menghasilkan aturan klasifikasi berdasarkan atribut Percent Gross Profit, Gross Profit, Industry Code, dan Competitive Rating untuk memprediksi kategori Gross Sales.</w:t>
       </w:r>
     </w:p>
     <w:p>
@@ -1647,68 +453,22 @@
         <w:pStyle w:val="Heading1"/>
       </w:pPr>
       <w:r>
-        <w:t>BAB 5: KESIMPULAN DAN SARAN</w:t>
-      </w:r>
-    </w:p>
-    <w:p>
-      <w:pPr>
-        <w:pStyle w:val="Heading2"/>
-      </w:pPr>
-      <w:r>
-        <w:t>5.1 Kesimpulan</w:t>
+        <w:t>5. Kesimpulan</w:t>
       </w:r>
     </w:p>
     <w:p>
       <w:r>
-        <w:t>Berdasarkan analisis yang telah dilakukan, dapat disimpulkan bahwa:</w:t>
+        <w:t>1. Model Decision Tree berhasil dibangun dari 60 data pelanggan dengan 5 atribut prediktor.</w:t>
       </w:r>
     </w:p>
     <w:p>
       <w:r>
-        <w:t>1. Dataset Sales Data terdiri dari 62 baris dan 6 kolom dengan beberapa missing values yang berhasil ditangani menggunakan metode rata-rata.</w:t>
+        <w:t>2. Algoritma Gain Ratio digunakan sebagai criterion pemilihan atribut terbaik pada setiap node.</w:t>
       </w:r>
     </w:p>
     <w:p>
       <w:r>
-        <w:t>2. Model Decision Tree dengan criterion Gain Ratio berhasil dibangun untuk mengklasifikasikan pola penjualan berdasarkan atribut-atribut prediktor.</w:t>
-      </w:r>
-    </w:p>
-    <w:p>
-      <w:r>
-        <w:t>3. Alur proses yang benar di RapidMiner adalah: Read Excel → Replace Missing Values → Set Role → Numerical to Polynominal → Decision Tree → Result.</w:t>
-      </w:r>
-    </w:p>
-    <w:p>
-      <w:pPr>
-        <w:pStyle w:val="Heading2"/>
-      </w:pPr>
-      <w:r>
-        <w:t>5.2 Saran</w:t>
-      </w:r>
-    </w:p>
-    <w:p>
-      <w:r>
-        <w:t>Untuk pengembangan lebih lanjut, disarankan:</w:t>
-      </w:r>
-    </w:p>
-    <w:p>
-      <w:r>
-        <w:t>1. Menggunakan Discretize by Binning untuk mengkategorikan Gross Sales menjadi beberapa kelas yang lebih bermakna (Rendah/Sedang/Tinggi).</w:t>
-      </w:r>
-    </w:p>
-    <w:p>
-      <w:r>
-        <w:t>2. Menambahkan operator Cross Validation untuk mengevaluasi performa model secara lebih objektif.</w:t>
-      </w:r>
-    </w:p>
-    <w:p>
-      <w:r>
-        <w:t>3. Membandingkan dengan algoritma lain seperti Random Forest atau Gradient Boosted Trees untuk mendapatkan akurasi yang lebih baik.</w:t>
-      </w:r>
-    </w:p>
-    <w:p>
-      <w:r>
-        <w:t>4. Menambah jumlah data untuk meningkatkan reliabilitas model.</w:t>
+        <w:t>3. Untuk pengembangan, disarankan menggunakan Discretize by Binning agar Gross Sales dikategorikan menjadi kelompok (Rendah/Sedang/Tinggi) dan menambahkan evaluasi model menggunakan Cross Validation.</w:t>
       </w:r>
     </w:p>
     <w:sectPr>

</xml_diff>

<commit_message>
Update laporan: analisis Decision Tree dengan Discretize by Binning (3 kategori)
</commit_message>
<xml_diff>
--- a/Laporan_Analisis_Decision_Tree.docx
+++ b/Laporan_Analisis_Decision_Tree.docx
@@ -326,18 +326,13 @@
           </w:tcPr>
           <w:p>
             <w:r>
-              <w:t>Rating kompetisi (1-5)</w:t>
+              <w:t>Rating kompetisi (1=sangat sedikit kompetisi, 5=sangat kompetitif)</w:t>
             </w:r>
           </w:p>
         </w:tc>
       </w:tr>
     </w:tbl>
     <w:p/>
-    <w:p>
-      <w:r>
-        <w:t>Catatan: Competitive Rating menunjukkan tingkat persaingan penjualan produk (1 = sangat sedikit kompetisi, 5 = sangat kompetitif).</w:t>
-      </w:r>
-    </w:p>
     <w:p>
       <w:pPr>
         <w:pStyle w:val="Heading1"/>
@@ -353,33 +348,33 @@
     </w:p>
     <w:p>
       <w:r>
-        <w:t>1. Read Excel → Membaca data Sales Data.xlsx</w:t>
+        <w:t>1. Read Excel - Membaca data Sales Data.xlsx</w:t>
       </w:r>
     </w:p>
     <w:p>
       <w:r>
-        <w:t>2. Replace Missing Values → Mengisi data kosong dengan rata-rata</w:t>
+        <w:t>2. Replace Missing Values - Mengisi data kosong dengan rata-rata</w:t>
       </w:r>
     </w:p>
     <w:p>
       <w:r>
-        <w:t>3. Set Role → Menentukan "Gross Sales" sebagai label</w:t>
+        <w:t>3. Set Role - Menentukan "Gross Sales" sebagai label</w:t>
       </w:r>
     </w:p>
     <w:p>
       <w:r>
-        <w:t>4. Numerical to Polynominal → Mengubah Gross Sales ke tipe nominal</w:t>
+        <w:t>4. Discretize by Binning - Membagi Gross Sales menjadi 3 kategori</w:t>
       </w:r>
     </w:p>
     <w:p>
       <w:r>
-        <w:t>5. Decision Tree → Membangun model (criterion: Gain Ratio, max depth: 10)</w:t>
+        <w:t>5. Decision Tree - Membangun model (criterion: Gain Ratio, max depth: 10)</w:t>
       </w:r>
     </w:p>
     <w:p/>
     <w:p>
       <w:r>
-        <w:t>Decision Tree dengan Gain Ratio dipilih karena mampu mengatasi bias terhadap atribut dengan banyak nilai, sehingga menghasilkan pembagian pohon yang lebih seimbang.</w:t>
+        <w:t>Discretize by Binning digunakan untuk mengubah nilai Gross Sales yang kontinu menjadi 3 kategori (bin) yang sama lebar, sehingga Decision Tree dapat menghasilkan aturan klasifikasi yang bermakna dan mudah diinterpretasi.</w:t>
       </w:r>
     </w:p>
     <w:p>
@@ -388,6 +383,177 @@
       </w:pPr>
       <w:r>
         <w:t>4. Hasil Analisis</w:t>
+      </w:r>
+    </w:p>
+    <w:p>
+      <w:pPr>
+        <w:pStyle w:val="Heading2"/>
+      </w:pPr>
+      <w:r>
+        <w:t>4.1 Kategori Gross Sales</w:t>
+      </w:r>
+    </w:p>
+    <w:p>
+      <w:r>
+        <w:t>Setelah proses Discretize by Binning, Gross Sales dibagi menjadi 3 kategori:</w:t>
+      </w:r>
+    </w:p>
+    <w:tbl>
+      <w:tblPr>
+        <w:tblStyle w:val="TableGrid"/>
+        <w:tblW w:type="auto" w:w="0"/>
+        <w:tblLook w:firstColumn="1" w:firstRow="1" w:lastColumn="0" w:lastRow="0" w:noHBand="0" w:noVBand="1" w:val="04A0"/>
+      </w:tblPr>
+      <w:tblGrid>
+        <w:gridCol w:w="2880"/>
+        <w:gridCol w:w="2880"/>
+        <w:gridCol w:w="2880"/>
+      </w:tblGrid>
+      <w:tr>
+        <w:tc>
+          <w:tcPr>
+            <w:tcW w:type="dxa" w:w="2880"/>
+          </w:tcPr>
+          <w:p>
+            <w:r>
+              <w:rPr>
+                <w:b/>
+              </w:rPr>
+              <w:t>Kategori</w:t>
+            </w:r>
+          </w:p>
+        </w:tc>
+        <w:tc>
+          <w:tcPr>
+            <w:tcW w:type="dxa" w:w="2880"/>
+          </w:tcPr>
+          <w:p>
+            <w:r>
+              <w:rPr>
+                <w:b/>
+              </w:rPr>
+              <w:t>Rentang Nilai</w:t>
+            </w:r>
+          </w:p>
+        </w:tc>
+        <w:tc>
+          <w:tcPr>
+            <w:tcW w:type="dxa" w:w="2880"/>
+          </w:tcPr>
+          <w:p>
+            <w:r>
+              <w:rPr>
+                <w:b/>
+              </w:rPr>
+              <w:t>Interpretasi</w:t>
+            </w:r>
+          </w:p>
+        </w:tc>
+      </w:tr>
+      <w:tr>
+        <w:tc>
+          <w:tcPr>
+            <w:tcW w:type="dxa" w:w="2880"/>
+          </w:tcPr>
+          <w:p>
+            <w:r>
+              <w:t>range1</w:t>
+            </w:r>
+          </w:p>
+        </w:tc>
+        <w:tc>
+          <w:tcPr>
+            <w:tcW w:type="dxa" w:w="2880"/>
+          </w:tcPr>
+          <w:p>
+            <w:r>
+              <w:t>-∞ sampai 59,813.667</w:t>
+            </w:r>
+          </w:p>
+        </w:tc>
+        <w:tc>
+          <w:tcPr>
+            <w:tcW w:type="dxa" w:w="2880"/>
+          </w:tcPr>
+          <w:p>
+            <w:r>
+              <w:t>Penjualan Rendah</w:t>
+            </w:r>
+          </w:p>
+        </w:tc>
+      </w:tr>
+      <w:tr>
+        <w:tc>
+          <w:tcPr>
+            <w:tcW w:type="dxa" w:w="2880"/>
+          </w:tcPr>
+          <w:p>
+            <w:r>
+              <w:t>range2</w:t>
+            </w:r>
+          </w:p>
+        </w:tc>
+        <w:tc>
+          <w:tcPr>
+            <w:tcW w:type="dxa" w:w="2880"/>
+          </w:tcPr>
+          <w:p>
+            <w:r>
+              <w:t>59,813.667 sampai 119,457.333</w:t>
+            </w:r>
+          </w:p>
+        </w:tc>
+        <w:tc>
+          <w:tcPr>
+            <w:tcW w:type="dxa" w:w="2880"/>
+          </w:tcPr>
+          <w:p>
+            <w:r>
+              <w:t>Penjualan Sedang</w:t>
+            </w:r>
+          </w:p>
+        </w:tc>
+      </w:tr>
+      <w:tr>
+        <w:tc>
+          <w:tcPr>
+            <w:tcW w:type="dxa" w:w="2880"/>
+          </w:tcPr>
+          <w:p>
+            <w:r>
+              <w:t>range3</w:t>
+            </w:r>
+          </w:p>
+        </w:tc>
+        <w:tc>
+          <w:tcPr>
+            <w:tcW w:type="dxa" w:w="2880"/>
+          </w:tcPr>
+          <w:p>
+            <w:r>
+              <w:t>119,457.333 sampai ∞</w:t>
+            </w:r>
+          </w:p>
+        </w:tc>
+        <w:tc>
+          <w:tcPr>
+            <w:tcW w:type="dxa" w:w="2880"/>
+          </w:tcPr>
+          <w:p>
+            <w:r>
+              <w:t>Penjualan Tinggi</w:t>
+            </w:r>
+          </w:p>
+        </w:tc>
+      </w:tr>
+    </w:tbl>
+    <w:p/>
+    <w:p>
+      <w:pPr>
+        <w:pStyle w:val="Heading2"/>
+      </w:pPr>
+      <w:r>
+        <w:t>4.2 Visualisasi Decision Tree</w:t>
       </w:r>
     </w:p>
     <w:p>
@@ -411,7 +577,7 @@
               <a:graphicData uri="http://schemas.openxmlformats.org/drawingml/2006/picture">
                 <pic:pic>
                   <pic:nvPicPr>
-                    <pic:cNvPr id="0" name="result.png"/>
+                    <pic:cNvPr id="0" name="Decision tree.png"/>
                     <pic:cNvPicPr/>
                   </pic:nvPicPr>
                   <pic:blipFill>
@@ -444,8 +610,101 @@
     </w:p>
     <w:p/>
     <w:p>
+      <w:pPr>
+        <w:pStyle w:val="Heading2"/>
+      </w:pPr>
       <w:r>
-        <w:t>Model Decision Tree berhasil dibangun dan menghasilkan aturan klasifikasi berdasarkan atribut Percent Gross Profit, Gross Profit, Industry Code, dan Competitive Rating untuk memprediksi kategori Gross Sales.</w:t>
+        <w:t>4.3 Aturan Klasifikasi (Rules)</w:t>
+      </w:r>
+    </w:p>
+    <w:p>
+      <w:r>
+        <w:t>Dari pohon keputusan di atas, dapat dibaca aturan-aturan berikut:</w:t>
+      </w:r>
+    </w:p>
+    <w:p/>
+    <w:p>
+      <w:r>
+        <w:rPr>
+          <w:b/>
+        </w:rPr>
+        <w:t xml:space="preserve">Aturan 1: </w:t>
+      </w:r>
+      <w:r>
+        <w:t>JIKA Gross Profit &gt; 20,999.845 MAKA Gross Sales = range3 (TINGGI)</w:t>
+      </w:r>
+    </w:p>
+    <w:p>
+      <w:r>
+        <w:t>Interpretasi: Jika laba kotor lebih dari ~21.000, maka penjualan tergolong tinggi (di atas 119.457).</w:t>
+      </w:r>
+    </w:p>
+    <w:p/>
+    <w:p>
+      <w:r>
+        <w:rPr>
+          <w:b/>
+        </w:rPr>
+        <w:t xml:space="preserve">Aturan 2: </w:t>
+      </w:r>
+      <w:r>
+        <w:t>JIKA Gross Profit ≤ 20,999.845 DAN Gross Profit &gt; 12,616 MAKA Gross Sales = range2 (SEDANG)</w:t>
+      </w:r>
+    </w:p>
+    <w:p>
+      <w:r>
+        <w:t>Interpretasi: Jika laba kotor antara ~12.616 sampai ~21.000, maka penjualan tergolong sedang (59.813 - 119.457).</w:t>
+      </w:r>
+    </w:p>
+    <w:p/>
+    <w:p>
+      <w:r>
+        <w:rPr>
+          <w:b/>
+        </w:rPr>
+        <w:t xml:space="preserve">Aturan 3: </w:t>
+      </w:r>
+      <w:r>
+        <w:t>JIKA Gross Profit ≤ 12,616 DAN Competitive Rating* ≤ 4.500 MAKA Gross Sales = range1 (RENDAH)</w:t>
+      </w:r>
+    </w:p>
+    <w:p>
+      <w:r>
+        <w:t>Interpretasi: Jika laba kotor ≤ 12.616 DAN tingkat persaingan tidak terlalu tinggi (≤ 4.5), maka penjualan tergolong rendah (di bawah 59.813).</w:t>
+      </w:r>
+    </w:p>
+    <w:p/>
+    <w:p>
+      <w:r>
+        <w:rPr>
+          <w:b/>
+        </w:rPr>
+        <w:t xml:space="preserve">Aturan 4: </w:t>
+      </w:r>
+      <w:r>
+        <w:t>JIKA Gross Profit ≤ 12,616 DAN Competitive Rating* &gt; 4.500 DAN Gross Profit &gt; 4,501.625 MAKA Gross Sales = range2 (SEDANG)</w:t>
+      </w:r>
+    </w:p>
+    <w:p>
+      <w:r>
+        <w:t>Interpretasi: Jika laba kotor ≤ 12.616 DAN persaingan sangat tinggi (&gt; 4.5) DAN laba kotor &gt; 4.501, maka penjualan tetap tergolong sedang.</w:t>
+      </w:r>
+    </w:p>
+    <w:p/>
+    <w:p>
+      <w:r>
+        <w:rPr>
+          <w:b/>
+        </w:rPr>
+        <w:t xml:space="preserve">Aturan 5: </w:t>
+      </w:r>
+      <w:r>
+        <w:t>JIKA Gross Profit ≤ 12,616 DAN Competitive Rating* &gt; 4.500 DAN Gross Profit ≤ 4,501.625 MAKA Gross Sales = range1 (RENDAH)</w:t>
+      </w:r>
+    </w:p>
+    <w:p>
+      <w:r>
+        <w:t>Interpretasi: Jika laba kotor ≤ 12.616 DAN persaingan sangat tinggi DAN laba kotor ≤ 4.501, maka penjualan tergolong rendah.</w:t>
       </w:r>
     </w:p>
     <w:p>
@@ -458,17 +717,22 @@
     </w:p>
     <w:p>
       <w:r>
-        <w:t>1. Model Decision Tree berhasil dibangun dari 60 data pelanggan dengan 5 atribut prediktor.</w:t>
+        <w:t>Berdasarkan analisis Decision Tree, diperoleh temuan sebagai berikut:</w:t>
       </w:r>
     </w:p>
     <w:p>
       <w:r>
-        <w:t>2. Algoritma Gain Ratio digunakan sebagai criterion pemilihan atribut terbaik pada setiap node.</w:t>
+        <w:t>1. Gross Profit (Laba Kotor) adalah faktor paling penting (node root/akar) yang menentukan level penjualan. Semakin tinggi laba kotor, semakin tinggi kategori penjualan.</w:t>
       </w:r>
     </w:p>
     <w:p>
       <w:r>
-        <w:t>3. Untuk pengembangan, disarankan menggunakan Discretize by Binning agar Gross Sales dikategorikan menjadi kelompok (Rendah/Sedang/Tinggi) dan menambahkan evaluasi model menggunakan Cross Validation.</w:t>
+        <w:t>2. Competitive Rating (Rating Kompetisi) hanya berpengaruh ketika Gross Profit berada di level rendah (≤ 12.616). Pada kondisi ini, tingkat persaingan yang tinggi (&gt; 4.5) dapat meningkatkan kategori penjualan dari Rendah menjadi Sedang.</w:t>
+      </w:r>
+    </w:p>
+    <w:p>
+      <w:r>
+        <w:t>3. Aturan paling sederhana: Jika laba kotor &gt; 21.000, maka penjualan pasti tergolong Tinggi.</w:t>
       </w:r>
     </w:p>
     <w:sectPr>

</xml_diff>

<commit_message>
Update laporan: tambah gambar desain proses (Proses.png) di bagian Metodologi
</commit_message>
<xml_diff>
--- a/Laporan_Analisis_Decision_Tree.docx
+++ b/Laporan_Analisis_Decision_Tree.docx
@@ -374,6 +374,59 @@
     <w:p/>
     <w:p>
       <w:r>
+        <w:t>Berikut adalah desain proses (workflow) di RapidMiner AI Studio:</w:t>
+      </w:r>
+    </w:p>
+    <w:p>
+      <w:pPr>
+        <w:jc w:val="center"/>
+      </w:pPr>
+      <w:r>
+        <w:drawing>
+          <wp:inline xmlns:a="http://schemas.openxmlformats.org/drawingml/2006/main" xmlns:pic="http://schemas.openxmlformats.org/drawingml/2006/picture">
+            <wp:extent cx="5486400" cy="3511995"/>
+            <wp:docPr id="1" name="Picture 1"/>
+            <wp:cNvGraphicFramePr>
+              <a:graphicFrameLocks noChangeAspect="1"/>
+            </wp:cNvGraphicFramePr>
+            <a:graphic>
+              <a:graphicData uri="http://schemas.openxmlformats.org/drawingml/2006/picture">
+                <pic:pic>
+                  <pic:nvPicPr>
+                    <pic:cNvPr id="0" name="Proses.png"/>
+                    <pic:cNvPicPr/>
+                  </pic:nvPicPr>
+                  <pic:blipFill>
+                    <a:blip r:embed="rId9"/>
+                    <a:stretch>
+                      <a:fillRect/>
+                    </a:stretch>
+                  </pic:blipFill>
+                  <pic:spPr>
+                    <a:xfrm>
+                      <a:off x="0" y="0"/>
+                      <a:ext cx="5486400" cy="3511995"/>
+                    </a:xfrm>
+                    <a:prstGeom prst="rect"/>
+                  </pic:spPr>
+                </pic:pic>
+              </a:graphicData>
+            </a:graphic>
+          </wp:inline>
+        </w:drawing>
+      </w:r>
+    </w:p>
+    <w:p>
+      <w:pPr>
+        <w:jc w:val="center"/>
+      </w:pPr>
+      <w:r>
+        <w:t>Gambar 1: Desain Proses di RapidMiner AI Studio</w:t>
+      </w:r>
+    </w:p>
+    <w:p/>
+    <w:p>
+      <w:r>
         <w:t>Discretize by Binning digunakan untuk mengubah nilai Gross Sales yang kontinu menjadi 3 kategori (bin) yang sama lebar, sehingga Decision Tree dapat menghasilkan aturan klasifikasi yang bermakna dan mudah diinterpretasi.</w:t>
       </w:r>
     </w:p>
@@ -569,7 +622,7 @@
         <w:drawing>
           <wp:inline xmlns:a="http://schemas.openxmlformats.org/drawingml/2006/main" xmlns:pic="http://schemas.openxmlformats.org/drawingml/2006/picture">
             <wp:extent cx="5486400" cy="3131948"/>
-            <wp:docPr id="1" name="Picture 1"/>
+            <wp:docPr id="2" name="Picture 2"/>
             <wp:cNvGraphicFramePr>
               <a:graphicFrameLocks noChangeAspect="1"/>
             </wp:cNvGraphicFramePr>
@@ -581,7 +634,7 @@
                     <pic:cNvPicPr/>
                   </pic:nvPicPr>
                   <pic:blipFill>
-                    <a:blip r:embed="rId9"/>
+                    <a:blip r:embed="rId10"/>
                     <a:stretch>
                       <a:fillRect/>
                     </a:stretch>
@@ -605,7 +658,7 @@
         <w:jc w:val="center"/>
       </w:pPr>
       <w:r>
-        <w:t>Gambar 1: Hasil Decision Tree</w:t>
+        <w:t>Gambar 2: Hasil Decision Tree</w:t>
       </w:r>
     </w:p>
     <w:p/>

</xml_diff>